<commit_message>
Added sample-based sound effects when 16K of sideways RAM is detected. Changes include:  - Introduced Sample.6502 which encapsulates the sample playback functionality.  - Added WAVConverter project that converts three sound effect WAV files to a compressed pcm data file.  - Updated LevelEditor, adding an additional level setting. Also renamed coefficients to settings.
</commit_message>
<xml_diff>
--- a/Development.docx
+++ b/Development.docx
@@ -3668,7 +3668,15 @@
     </w:p>
     <w:p>
       <w:r>
-        <w:t xml:space="preserve">I updated the level model to hold this occupancy information directly within the page tile grids, which up until this point just held tile indices (values 0..31).  I used one of the three unused </w:t>
+        <w:t xml:space="preserve">I updated the level model to hold this occupancy information directly within the page tile grids, which up until this point just held tile indices (values </w:t>
+      </w:r>
+      <w:proofErr w:type="gramStart"/>
+      <w:r>
+        <w:t>0..</w:t>
+      </w:r>
+      <w:proofErr w:type="gramEnd"/>
+      <w:r>
+        <w:t xml:space="preserve">31).  I used one of the three unused </w:t>
       </w:r>
       <w:r>
         <w:t xml:space="preserve">high </w:t>
@@ -4480,11 +4488,16 @@
       <w:r>
         <w:t xml:space="preserve">Object’s </w:t>
       </w:r>
+      <w:proofErr w:type="gramStart"/>
       <w:r>
         <w:t xml:space="preserve">top </w:t>
       </w:r>
       <w:r>
-        <w:t xml:space="preserve">level </w:t>
+        <w:t>level</w:t>
+      </w:r>
+      <w:proofErr w:type="gramEnd"/>
+      <w:r>
+        <w:t xml:space="preserve"> </w:t>
       </w:r>
       <w:r>
         <w:t>coordinate</w:t>
@@ -5945,7 +5958,23 @@
         <w:t>by something</w:t>
       </w:r>
       <w:r>
-        <w:t>, and bits 0..5 hold the tile index (values 0..31).</w:t>
+        <w:t xml:space="preserve">, and bits </w:t>
+      </w:r>
+      <w:proofErr w:type="gramStart"/>
+      <w:r>
+        <w:t>0..</w:t>
+      </w:r>
+      <w:proofErr w:type="gramEnd"/>
+      <w:r>
+        <w:t xml:space="preserve">5 hold the tile index (values </w:t>
+      </w:r>
+      <w:proofErr w:type="gramStart"/>
+      <w:r>
+        <w:t>0..</w:t>
+      </w:r>
+      <w:proofErr w:type="gramEnd"/>
+      <w:r>
+        <w:t>31).</w:t>
       </w:r>
       <w:r>
         <w:t xml:space="preserve"> </w:t>
@@ -6355,10 +6384,12 @@
         <w:t xml:space="preserve">and show this information in a </w:t>
       </w:r>
       <w:proofErr w:type="spellStart"/>
+      <w:proofErr w:type="gramStart"/>
       <w:r>
         <w:t>gamebar</w:t>
       </w:r>
       <w:proofErr w:type="spellEnd"/>
+      <w:proofErr w:type="gramEnd"/>
       <w:r>
         <w:t>, located at the top right of the screen.</w:t>
       </w:r>
@@ -6582,10 +6613,12 @@
         <w:t xml:space="preserve"> </w:t>
       </w:r>
       <w:proofErr w:type="spellStart"/>
+      <w:proofErr w:type="gramStart"/>
       <w:r>
         <w:t>gamebar</w:t>
       </w:r>
       <w:proofErr w:type="spellEnd"/>
+      <w:proofErr w:type="gramEnd"/>
       <w:r>
         <w:t>.</w:t>
       </w:r>
@@ -6738,10 +6771,12 @@
         <w:t xml:space="preserve">draw the </w:t>
       </w:r>
       <w:proofErr w:type="spellStart"/>
+      <w:proofErr w:type="gramStart"/>
       <w:r>
         <w:t>gamebar</w:t>
       </w:r>
       <w:proofErr w:type="spellEnd"/>
+      <w:proofErr w:type="gramEnd"/>
       <w:r>
         <w:t xml:space="preserve"> and </w:t>
       </w:r>
@@ -6777,16 +6812,37 @@
         <w:t xml:space="preserve">code to show the </w:t>
       </w:r>
       <w:r>
-        <w:t>current level number</w:t>
-      </w:r>
-      <w:r>
-        <w:t xml:space="preserve">, and </w:t>
-      </w:r>
-      <w:r>
-        <w:t>extended the number of supported digits from four (0..3) to ten (</w:t>
-      </w:r>
-      <w:r>
-        <w:t>0..9).</w:t>
+        <w:t xml:space="preserve">current level </w:t>
+      </w:r>
+      <w:proofErr w:type="gramStart"/>
+      <w:r>
+        <w:t>number</w:t>
+      </w:r>
+      <w:r>
+        <w:t>, and</w:t>
+      </w:r>
+      <w:proofErr w:type="gramEnd"/>
+      <w:r>
+        <w:t xml:space="preserve"> </w:t>
+      </w:r>
+      <w:r>
+        <w:t>extended the number of supported digits from four (</w:t>
+      </w:r>
+      <w:proofErr w:type="gramStart"/>
+      <w:r>
+        <w:t>0..</w:t>
+      </w:r>
+      <w:proofErr w:type="gramEnd"/>
+      <w:r>
+        <w:t>3) to ten (</w:t>
+      </w:r>
+      <w:proofErr w:type="gramStart"/>
+      <w:r>
+        <w:t>0..</w:t>
+      </w:r>
+      <w:proofErr w:type="gramEnd"/>
+      <w:r>
+        <w:t>9).</w:t>
       </w:r>
       <w:r>
         <w:t xml:space="preserve">  Numerous code size optimizations were needed to free up sufficient space for the</w:t>
@@ -8552,6 +8608,7 @@
         <w:t xml:space="preserve">the </w:t>
       </w:r>
       <w:proofErr w:type="spellStart"/>
+      <w:proofErr w:type="gramStart"/>
       <w:r>
         <w:rPr>
           <w:i/>
@@ -8560,6 +8617,7 @@
         <w:t>objectState</w:t>
       </w:r>
       <w:proofErr w:type="spellEnd"/>
+      <w:proofErr w:type="gramEnd"/>
       <w:r>
         <w:t xml:space="preserve"> variable</w:t>
       </w:r>
@@ -10594,7 +10652,11 @@
         <w:t xml:space="preserve">o-page (transient variables) </w:t>
       </w:r>
       <w:r>
-        <w:t xml:space="preserve">for the </w:t>
+        <w:t xml:space="preserve">for </w:t>
+      </w:r>
+      <w:proofErr w:type="gramStart"/>
+      <w:r>
+        <w:t xml:space="preserve">the </w:t>
       </w:r>
       <w:r>
         <w:rPr>
@@ -10603,6 +10665,7 @@
         </w:rPr>
         <w:t>counts</w:t>
       </w:r>
+      <w:proofErr w:type="gramEnd"/>
       <w:r>
         <w:t xml:space="preserve"> </w:t>
       </w:r>
@@ -11944,8 +12007,13 @@
       <w:r>
         <w:t xml:space="preserve">final list of </w:t>
       </w:r>
-      <w:r>
-        <w:t>pursue behavior</w:t>
+      <w:proofErr w:type="gramStart"/>
+      <w:r>
+        <w:t>pursue</w:t>
+      </w:r>
+      <w:proofErr w:type="gramEnd"/>
+      <w:r>
+        <w:t xml:space="preserve"> behavior</w:t>
       </w:r>
       <w:r>
         <w:t>al</w:t>
@@ -12012,6 +12080,7 @@
         <w:t xml:space="preserve"> </w:t>
       </w:r>
       <w:proofErr w:type="spellStart"/>
+      <w:proofErr w:type="gramStart"/>
       <w:r>
         <w:rPr>
           <w:b/>
@@ -12032,7 +12101,11 @@
         <w:t xml:space="preserve"> </w:t>
       </w:r>
       <w:r>
-        <w:t xml:space="preserve"> – </w:t>
+        <w:t xml:space="preserve"> –</w:t>
+      </w:r>
+      <w:proofErr w:type="gramEnd"/>
+      <w:r>
+        <w:t xml:space="preserve"> </w:t>
       </w:r>
       <w:r>
         <w:t xml:space="preserve">Daleks </w:t>
@@ -12158,6 +12231,7 @@
         <w:t xml:space="preserve"> </w:t>
       </w:r>
       <w:proofErr w:type="spellStart"/>
+      <w:proofErr w:type="gramStart"/>
       <w:r>
         <w:rPr>
           <w:b/>
@@ -12178,7 +12252,11 @@
         <w:t xml:space="preserve"> </w:t>
       </w:r>
       <w:r>
-        <w:t xml:space="preserve"> – Daleks </w:t>
+        <w:t xml:space="preserve"> –</w:t>
+      </w:r>
+      <w:proofErr w:type="gramEnd"/>
+      <w:r>
+        <w:t xml:space="preserve"> Daleks </w:t>
       </w:r>
       <w:r>
         <w:t>move quickly left or right</w:t>
@@ -12674,6 +12752,7 @@
       <w:r>
         <w:t xml:space="preserve">Daleks whose action is </w:t>
       </w:r>
+      <w:proofErr w:type="gramStart"/>
       <w:r>
         <w:rPr>
           <w:b/>
@@ -12683,6 +12762,7 @@
         </w:rPr>
         <w:t>pursue</w:t>
       </w:r>
+      <w:proofErr w:type="gramEnd"/>
       <w:r>
         <w:t xml:space="preserve"> are downgraded to </w:t>
       </w:r>
@@ -12906,12 +12986,14 @@
       <w:r>
         <w:t xml:space="preserve"> </w:t>
       </w:r>
+      <w:proofErr w:type="gramStart"/>
       <w:r>
         <w:t xml:space="preserve">the  </w:t>
       </w:r>
       <w:r>
         <w:t>Dalek’s</w:t>
       </w:r>
+      <w:proofErr w:type="gramEnd"/>
       <w:r>
         <w:t xml:space="preserve"> </w:t>
       </w:r>
@@ -13223,6 +13305,7 @@
         <w:t xml:space="preserve">e to support this.  Fortunately, the low nibble of the elevator’s </w:t>
       </w:r>
       <w:proofErr w:type="spellStart"/>
+      <w:proofErr w:type="gramStart"/>
       <w:r>
         <w:rPr>
           <w:i/>
@@ -13231,6 +13314,7 @@
         <w:t>objectState</w:t>
       </w:r>
       <w:proofErr w:type="spellEnd"/>
+      <w:proofErr w:type="gramEnd"/>
       <w:r>
         <w:t xml:space="preserve"> variable </w:t>
       </w:r>
@@ -13306,7 +13390,15 @@
         <w:t>s</w:t>
       </w:r>
       <w:r>
-        <w:t xml:space="preserve"> in their draw order</w:t>
+        <w:t xml:space="preserve"> in their </w:t>
+      </w:r>
+      <w:proofErr w:type="gramStart"/>
+      <w:r>
+        <w:t>draw</w:t>
+      </w:r>
+      <w:proofErr w:type="gramEnd"/>
+      <w:r>
+        <w:t xml:space="preserve"> order</w:t>
       </w:r>
       <w:r>
         <w:t xml:space="preserve">, as descending elevators need to be rendered before </w:t>
@@ -13450,18 +13542,31 @@
         <w:t xml:space="preserve"> - When one or more Daleks are in pursuit of K9, a </w:t>
       </w:r>
       <w:proofErr w:type="spellStart"/>
+      <w:proofErr w:type="gramStart"/>
       <w:r>
         <w:t>PacMan</w:t>
       </w:r>
       <w:proofErr w:type="spellEnd"/>
       <w:r>
-        <w:t xml:space="preserve"> like sound effect plays, giving the player a sense of pressure.  The sound effect provide</w:t>
+        <w:t xml:space="preserve"> like</w:t>
+      </w:r>
+      <w:proofErr w:type="gramEnd"/>
+      <w:r>
+        <w:t xml:space="preserve"> sound effect plays, giving the player a sense of pressure.  The sound effect provide</w:t>
       </w:r>
       <w:r>
         <w:t>s</w:t>
       </w:r>
       <w:r>
-        <w:t xml:space="preserve"> an important que as there may be times when a Dalek sees K9 before the player sees the Dalek!</w:t>
+        <w:t xml:space="preserve"> an important </w:t>
+      </w:r>
+      <w:proofErr w:type="gramStart"/>
+      <w:r>
+        <w:t>que</w:t>
+      </w:r>
+      <w:proofErr w:type="gramEnd"/>
+      <w:r>
+        <w:t xml:space="preserve"> as there may be times when a Dalek sees K9 before the player sees the Dalek!</w:t>
       </w:r>
     </w:p>
     <w:p>
@@ -13583,7 +13688,15 @@
         <w:t>K9 is hurt</w:t>
       </w:r>
       <w:r>
-        <w:t xml:space="preserve"> – when K9 is damaged by an Dalek weapon, an annoying white noise sound effect is played, which is quite unpleasant.  It </w:t>
+        <w:t xml:space="preserve"> – when K9 is damaged by </w:t>
+      </w:r>
+      <w:proofErr w:type="gramStart"/>
+      <w:r>
+        <w:t>an</w:t>
+      </w:r>
+      <w:proofErr w:type="gramEnd"/>
+      <w:r>
+        <w:t xml:space="preserve"> Dalek weapon, an annoying white noise sound effect is played, which is quite unpleasant.  It </w:t>
       </w:r>
       <w:r>
         <w:t xml:space="preserve">is </w:t>
@@ -13720,11 +13833,16 @@
         <w:t>‘</w:t>
       </w:r>
       <w:r>
-        <w:t>in pursuit</w:t>
+        <w:t xml:space="preserve">in </w:t>
+      </w:r>
+      <w:proofErr w:type="gramStart"/>
+      <w:r>
+        <w:t>pursuit</w:t>
       </w:r>
       <w:r>
         <w:t>’</w:t>
       </w:r>
+      <w:proofErr w:type="gramEnd"/>
       <w:r>
         <w:t xml:space="preserve"> sound effect.</w:t>
       </w:r>
@@ -14336,7 +14454,15 @@
         <w:t xml:space="preserve">in size </w:t>
       </w:r>
       <w:r>
-        <w:t>and uses 41 bytes of data (health bar atlas + sprite array).  The total memory required was 226 bytes</w:t>
+        <w:t xml:space="preserve">and uses 41 bytes of data (health bar atlas + </w:t>
+      </w:r>
+      <w:proofErr w:type="gramStart"/>
+      <w:r>
+        <w:t>sprite</w:t>
+      </w:r>
+      <w:proofErr w:type="gramEnd"/>
+      <w:r>
+        <w:t xml:space="preserve"> array).  The total memory required was 226 bytes</w:t>
       </w:r>
       <w:r>
         <w:t>.</w:t>
@@ -15554,7 +15680,15 @@
         <w:t>SN76489</w:t>
       </w:r>
       <w:r>
-        <w:t xml:space="preserve"> to output its highest frequency (125KHz), and 2) toggle the volume at twice the desired frequency.  Timer2 can be used for the latter, in one-shot mode.</w:t>
+        <w:t xml:space="preserve"> to output its highest frequency (125KHz), and 2) toggle the volume at twice the desired frequency.  </w:t>
+      </w:r>
+      <w:proofErr w:type="gramStart"/>
+      <w:r>
+        <w:t>Timer2</w:t>
+      </w:r>
+      <w:proofErr w:type="gramEnd"/>
+      <w:r>
+        <w:t xml:space="preserve"> can be used for the latter, in one-shot mode.</w:t>
       </w:r>
     </w:p>
     <w:p>
@@ -15574,10 +15708,7 @@
         <w:t>SN76489</w:t>
       </w:r>
       <w:r>
-        <w:t>’s</w:t>
-      </w:r>
-      <w:r>
-        <w:t xml:space="preserve"> </w:t>
+        <w:t xml:space="preserve">’s </w:t>
       </w:r>
       <w:r>
         <w:t>voltage output does not oscillate evenly around zero volts</w:t>
@@ -15646,23 +15777,7 @@
             <w:i/>
             <w:iCs/>
           </w:rPr>
-          <w:t xml:space="preserve">Security: Sampled sound 1980s style: from </w:t>
-        </w:r>
-        <w:r>
-          <w:rPr>
-            <w:rStyle w:val="Hyperlink"/>
-            <w:i/>
-            <w:iCs/>
-          </w:rPr>
-          <w:t>S</w:t>
-        </w:r>
-        <w:r>
-          <w:rPr>
-            <w:rStyle w:val="Hyperlink"/>
-            <w:i/>
-            <w:iCs/>
-          </w:rPr>
-          <w:t>N76489 square waves to samples</w:t>
+          <w:t>Security: Sampled sound 1980s style: from SN76489 square waves to samples</w:t>
         </w:r>
       </w:hyperlink>
       <w:r>
@@ -15679,6 +15794,9 @@
         <w:jc w:val="center"/>
       </w:pPr>
       <w:r>
+        <w:rPr>
+          <w:noProof/>
+        </w:rPr>
         <w:lastRenderedPageBreak/>
         <w:drawing>
           <wp:inline distT="0" distB="0" distL="0" distR="0" wp14:anchorId="7BAF8B86" wp14:editId="67E241BF">
@@ -16021,9 +16139,11 @@
         <w:lastRenderedPageBreak/>
         <w:t xml:space="preserve">I spent quite a bit of time tweaking the envelope definitions to get a more interesting sound. Of course, I was not able to replicate the original sound given </w:t>
       </w:r>
+      <w:proofErr w:type="gramStart"/>
       <w:r>
         <w:t>the Beeb’s</w:t>
       </w:r>
+      <w:proofErr w:type="gramEnd"/>
       <w:r>
         <w:t xml:space="preserve"> limited capabilities.  </w:t>
       </w:r>
@@ -16070,12 +16190,14 @@
       <w:r>
         <w:t xml:space="preserve">which </w:t>
       </w:r>
+      <w:proofErr w:type="gramStart"/>
       <w:r>
         <w:t>appear</w:t>
       </w:r>
       <w:r>
         <w:t>s</w:t>
       </w:r>
+      <w:proofErr w:type="gramEnd"/>
       <w:r>
         <w:t xml:space="preserve"> before the </w:t>
       </w:r>
@@ -16168,7 +16290,7 @@
     </w:p>
     <w:p>
       <w:r>
-        <w:t>Regardless, ‘</w:t>
+        <w:t xml:space="preserve">Regardless, </w:t>
       </w:r>
       <w:r>
         <w:rPr>
@@ -16180,163 +16302,151 @@
         <w:t>Adventures in Time</w:t>
       </w:r>
       <w:r>
+        <w:t xml:space="preserve"> seem</w:t>
+      </w:r>
+      <w:r>
+        <w:t>ed</w:t>
+      </w:r>
+      <w:r>
+        <w:t xml:space="preserve"> an apt title for the game</w:t>
+      </w:r>
+      <w:r>
+        <w:t xml:space="preserve"> so </w:t>
+      </w:r>
+      <w:r>
+        <w:t xml:space="preserve">I set about </w:t>
+      </w:r>
+      <w:r>
+        <w:t>design</w:t>
+      </w:r>
+      <w:r>
+        <w:t>ing</w:t>
+      </w:r>
+      <w:r>
+        <w:t xml:space="preserve"> </w:t>
+      </w:r>
+      <w:r>
+        <w:t xml:space="preserve">the </w:t>
+      </w:r>
+      <w:r>
+        <w:t xml:space="preserve">screen.  </w:t>
+      </w:r>
+      <w:r>
+        <w:t>I tried to replicate the same colors and mosaic font</w:t>
+      </w:r>
+      <w:r>
+        <w:t xml:space="preserve"> us</w:t>
+      </w:r>
+      <w:r>
+        <w:t>ed</w:t>
+      </w:r>
+      <w:r>
+        <w:t xml:space="preserve"> </w:t>
+      </w:r>
+      <w:r>
+        <w:t>in the</w:t>
+      </w:r>
+      <w:r>
+        <w:t xml:space="preserve"> </w:t>
+      </w:r>
+      <w:r>
+        <w:rPr>
+          <w:i/>
+          <w:iCs/>
+        </w:rPr>
+        <w:t>A</w:t>
+      </w:r>
+      <w:r>
+        <w:t>CORNSOFT screen</w:t>
+      </w:r>
+      <w:r>
+        <w:t>, but u</w:t>
+      </w:r>
+      <w:r>
+        <w:t>nfortuna</w:t>
+      </w:r>
+      <w:r>
+        <w:t>te</w:t>
+      </w:r>
+      <w:r>
+        <w:t xml:space="preserve">ly there was </w:t>
+      </w:r>
+      <w:proofErr w:type="gramStart"/>
+      <w:r>
+        <w:t>no</w:t>
+      </w:r>
+      <w:proofErr w:type="gramEnd"/>
+      <w:r>
+        <w:t xml:space="preserve"> enough</w:t>
+      </w:r>
+      <w:r>
+        <w:t xml:space="preserve"> room to fit </w:t>
+      </w:r>
+      <w:r>
+        <w:t>‘</w:t>
+      </w:r>
+      <w:r>
+        <w:rPr>
+          <w:i/>
+          <w:iCs/>
+        </w:rPr>
+        <w:t>A</w:t>
+      </w:r>
+      <w:r>
+        <w:t>DVENTURES</w:t>
+      </w:r>
+      <w:r>
+        <w:rPr>
+          <w:i/>
+          <w:iCs/>
+        </w:rPr>
+        <w:t>’</w:t>
+      </w:r>
+      <w:r>
+        <w:t xml:space="preserve"> </w:t>
+      </w:r>
+      <w:r>
+        <w:t xml:space="preserve">so </w:t>
+      </w:r>
+      <w:r>
+        <w:t>I change</w:t>
+      </w:r>
+      <w:r>
+        <w:t>d</w:t>
+      </w:r>
+      <w:r>
+        <w:t xml:space="preserve"> the </w:t>
+      </w:r>
+      <w:r>
+        <w:t xml:space="preserve">title </w:t>
+      </w:r>
+      <w:r>
+        <w:t xml:space="preserve">to </w:t>
+      </w:r>
+      <w:r>
         <w:rPr>
           <w:b/>
           <w:bCs/>
-        </w:rPr>
-        <w:t>’</w:t>
-      </w:r>
-      <w:r>
-        <w:t xml:space="preserve"> seem</w:t>
-      </w:r>
-      <w:r>
-        <w:t>ed</w:t>
-      </w:r>
-      <w:r>
-        <w:t xml:space="preserve"> an apt title for the game</w:t>
-      </w:r>
-      <w:r>
-        <w:t xml:space="preserve"> so </w:t>
-      </w:r>
-      <w:r>
-        <w:t xml:space="preserve">I set about </w:t>
-      </w:r>
-      <w:r>
-        <w:t>design</w:t>
-      </w:r>
-      <w:r>
-        <w:t>ing</w:t>
-      </w:r>
-      <w:r>
-        <w:t xml:space="preserve"> </w:t>
-      </w:r>
-      <w:r>
-        <w:t xml:space="preserve">the </w:t>
-      </w:r>
-      <w:r>
-        <w:t xml:space="preserve">screen.  </w:t>
-      </w:r>
-      <w:r>
-        <w:t>I tried to replicate the same colors and mosaic font</w:t>
-      </w:r>
-      <w:r>
-        <w:t xml:space="preserve"> us</w:t>
-      </w:r>
-      <w:r>
-        <w:t>ed</w:t>
-      </w:r>
-      <w:r>
-        <w:t xml:space="preserve"> </w:t>
-      </w:r>
-      <w:r>
-        <w:t>in the</w:t>
-      </w:r>
-      <w:r>
-        <w:t xml:space="preserve"> </w:t>
-      </w:r>
-      <w:r>
-        <w:rPr>
-          <w:i/>
-          <w:iCs/>
-        </w:rPr>
-        <w:t>A</w:t>
-      </w:r>
-      <w:r>
-        <w:t>CORNSOFT screen</w:t>
-      </w:r>
-      <w:r>
-        <w:t>, but u</w:t>
-      </w:r>
-      <w:r>
-        <w:t>nfortuna</w:t>
-      </w:r>
-      <w:r>
-        <w:t>te</w:t>
-      </w:r>
-      <w:r>
-        <w:t xml:space="preserve">ly there was </w:t>
-      </w:r>
-      <w:r>
-        <w:t>no enough</w:t>
-      </w:r>
-      <w:r>
-        <w:t xml:space="preserve"> room to fit </w:t>
-      </w:r>
-      <w:r>
-        <w:t>‘</w:t>
-      </w:r>
-      <w:r>
-        <w:rPr>
-          <w:i/>
-          <w:iCs/>
-        </w:rPr>
-        <w:t>A</w:t>
-      </w:r>
-      <w:r>
-        <w:t>DVENTURES</w:t>
-      </w:r>
-      <w:r>
-        <w:rPr>
-          <w:i/>
-          <w:iCs/>
-        </w:rPr>
-        <w:t>’</w:t>
-      </w:r>
-      <w:r>
-        <w:t xml:space="preserve"> </w:t>
-      </w:r>
-      <w:r>
-        <w:t xml:space="preserve">so </w:t>
-      </w:r>
-      <w:r>
-        <w:t>I change</w:t>
-      </w:r>
-      <w:r>
-        <w:t>d</w:t>
-      </w:r>
-      <w:r>
-        <w:t xml:space="preserve"> the </w:t>
-      </w:r>
-      <w:r>
-        <w:t xml:space="preserve">title </w:t>
-      </w:r>
-      <w:r>
-        <w:t xml:space="preserve">to </w:t>
-      </w:r>
-      <w:r>
-        <w:t>‘</w:t>
+          <w:i/>
+          <w:iCs/>
+        </w:rPr>
+        <w:t>An</w:t>
       </w:r>
       <w:r>
         <w:rPr>
           <w:b/>
           <w:bCs/>
-          <w:i/>
-          <w:iCs/>
-        </w:rPr>
-        <w:t>An</w:t>
+        </w:rPr>
+        <w:t xml:space="preserve"> </w:t>
       </w:r>
       <w:r>
         <w:rPr>
           <w:b/>
           <w:bCs/>
-        </w:rPr>
-        <w:t xml:space="preserve"> </w:t>
-      </w:r>
-      <w:r>
-        <w:rPr>
-          <w:b/>
-          <w:bCs/>
           <w:i/>
           <w:iCs/>
         </w:rPr>
         <w:t>Adventure in Time</w:t>
-      </w:r>
-      <w:r>
-        <w:rPr>
-          <w:b/>
-          <w:bCs/>
-        </w:rPr>
-        <w:t>’</w:t>
       </w:r>
       <w:r>
         <w:t xml:space="preserve"> which also </w:t>
@@ -16420,6 +16530,298 @@
         <w:pStyle w:val="Heading1"/>
       </w:pPr>
       <w:r>
+        <w:t>‘Exterminate’</w:t>
+      </w:r>
+    </w:p>
+    <w:p>
+      <w:r>
+        <w:t>One suggestion, which I really liked, was to use the speech synthesis chip to sound ‘</w:t>
+      </w:r>
+      <w:r>
+        <w:rPr>
+          <w:i/>
+          <w:iCs/>
+        </w:rPr>
+        <w:t>exterminate’</w:t>
+      </w:r>
+      <w:r>
+        <w:t>, when Daleks were pursuing K9.</w:t>
+      </w:r>
+    </w:p>
+    <w:p>
+      <w:r>
+        <w:lastRenderedPageBreak/>
+        <w:t xml:space="preserve">To do </w:t>
+      </w:r>
+      <w:r>
+        <w:t>this, “</w:t>
+      </w:r>
+      <w:r>
+        <w:rPr>
+          <w:i/>
+          <w:iCs/>
+        </w:rPr>
+        <w:t>exterminate</w:t>
+      </w:r>
+      <w:r>
+        <w:rPr>
+          <w:i/>
+          <w:iCs/>
+        </w:rPr>
+        <w:t xml:space="preserve">" </w:t>
+      </w:r>
+      <w:r>
+        <w:t xml:space="preserve">needed to be encoded/compressed using LPC (Linear Predictive Coding), a speech compression format that the Texas Instruments TMS-5220 speech chip in the BBC Micro </w:t>
+      </w:r>
+      <w:r>
+        <w:t>uses</w:t>
+      </w:r>
+      <w:r>
+        <w:t>.</w:t>
+      </w:r>
+    </w:p>
+    <w:p>
+      <w:r>
+        <w:t>Unfortunately, the Dalek voice, which is created using a ring modulator box, does not encode very well using LPC, which was designed specifically to encode human voices</w:t>
+      </w:r>
+      <w:r>
+        <w:t xml:space="preserve">, and </w:t>
+      </w:r>
+      <w:r>
+        <w:t xml:space="preserve">  Daleks don’t have a human voice.</w:t>
+      </w:r>
+    </w:p>
+    <w:p>
+      <w:r>
+        <w:t xml:space="preserve">I was </w:t>
+      </w:r>
+      <w:r>
+        <w:t xml:space="preserve">therefore </w:t>
+      </w:r>
+      <w:r>
+        <w:t xml:space="preserve">left with the choice of not implementing the </w:t>
+      </w:r>
+      <w:r>
+        <w:t>feature or</w:t>
+      </w:r>
+      <w:r>
+        <w:t xml:space="preserve"> trying to play </w:t>
+      </w:r>
+      <w:r>
+        <w:t>an “</w:t>
+      </w:r>
+      <w:r>
+        <w:rPr>
+          <w:i/>
+          <w:iCs/>
+        </w:rPr>
+        <w:t>exterminate</w:t>
+      </w:r>
+      <w:r>
+        <w:rPr>
+          <w:i/>
+          <w:iCs/>
+        </w:rPr>
+        <w:t>”</w:t>
+      </w:r>
+      <w:r>
+        <w:t xml:space="preserve"> sample instead</w:t>
+      </w:r>
+      <w:r>
+        <w:t xml:space="preserve">, which I knew would </w:t>
+      </w:r>
+      <w:r>
+        <w:t xml:space="preserve">have its own </w:t>
+      </w:r>
+      <w:r>
+        <w:t>challen</w:t>
+      </w:r>
+      <w:r>
+        <w:t>ges</w:t>
+      </w:r>
+      <w:r>
+        <w:t>.</w:t>
+      </w:r>
+    </w:p>
+    <w:p>
+      <w:r>
+        <w:t xml:space="preserve">Sampled music can be played on the BBC Micro </w:t>
+      </w:r>
+      <w:r>
+        <w:t xml:space="preserve">by </w:t>
+      </w:r>
+      <w:r>
+        <w:t xml:space="preserve">configuring the </w:t>
+      </w:r>
+      <w:r>
+        <w:t>SN76489</w:t>
+      </w:r>
+      <w:r>
+        <w:t xml:space="preserve"> to output its highest frequency (125KHz) and </w:t>
+      </w:r>
+      <w:r>
+        <w:t xml:space="preserve">then </w:t>
+      </w:r>
+      <w:r>
+        <w:t xml:space="preserve">modulating the volume using the PCM </w:t>
+      </w:r>
+      <w:r>
+        <w:t>sample</w:t>
+      </w:r>
+      <w:r>
+        <w:t xml:space="preserve"> data, at the frequency of the PCM encoding.</w:t>
+      </w:r>
+    </w:p>
+    <w:p>
+      <w:r>
+        <w:t xml:space="preserve">While doable, it’s quite hard to reproduce samples </w:t>
+      </w:r>
+      <w:r>
+        <w:t>at</w:t>
+      </w:r>
+      <w:r>
+        <w:t xml:space="preserve"> good </w:t>
+      </w:r>
+      <w:r>
+        <w:t xml:space="preserve">quality </w:t>
+      </w:r>
+      <w:r>
+        <w:t>for several reasons.</w:t>
+      </w:r>
+    </w:p>
+    <w:p>
+      <w:r>
+        <w:t>Firstly, the sound chip’s volume has to be updated at the encoding frequency.  For 8-bit/8KHz samples (a reasonable format to use), this happen</w:t>
+      </w:r>
+      <w:r>
+        <w:t>s</w:t>
+      </w:r>
+      <w:r>
+        <w:t xml:space="preserve"> 160 times a frame. </w:t>
+      </w:r>
+      <w:r>
+        <w:t xml:space="preserve"> If the update code takes 50 cycles to execute (a reasonable estimate), there will be </w:t>
+      </w:r>
+      <w:proofErr w:type="gramStart"/>
+      <w:r>
+        <w:t>20</w:t>
+      </w:r>
+      <w:proofErr w:type="gramEnd"/>
+      <w:r>
+        <w:t>% impact on game performance</w:t>
+      </w:r>
+      <w:r>
+        <w:t>, which is not good.</w:t>
+      </w:r>
+    </w:p>
+    <w:p>
+      <w:r>
+        <w:t xml:space="preserve">Secondly, </w:t>
+      </w:r>
+      <w:r>
+        <w:t xml:space="preserve">the effective resolution of the </w:t>
+      </w:r>
+      <w:r>
+        <w:t>SN76489</w:t>
+      </w:r>
+      <w:r>
+        <w:t xml:space="preserve"> is just four bits</w:t>
+      </w:r>
+      <w:r>
+        <w:t>,</w:t>
+      </w:r>
+      <w:r>
+        <w:t xml:space="preserve"> as </w:t>
+      </w:r>
+      <w:r>
+        <w:t xml:space="preserve">it only has </w:t>
+      </w:r>
+      <w:r>
+        <w:t>sixteen volume levels.</w:t>
+      </w:r>
+      <w:r>
+        <w:t xml:space="preserve">  </w:t>
+      </w:r>
+      <w:r>
+        <w:t>If 8-bit samples are used, half the bits are thrown away!  One can improve the quality by over-sampling at twice the frequency, but this doubles the impact</w:t>
+      </w:r>
+      <w:r>
+        <w:t xml:space="preserve"> on performance.</w:t>
+      </w:r>
+    </w:p>
+    <w:p>
+      <w:r>
+        <w:t xml:space="preserve">Thirdly, </w:t>
+      </w:r>
+      <w:r>
+        <w:t xml:space="preserve">sampled </w:t>
+      </w:r>
+      <w:r>
+        <w:t>data is large.  “</w:t>
+      </w:r>
+      <w:r>
+        <w:rPr>
+          <w:i/>
+          <w:iCs/>
+        </w:rPr>
+        <w:t>e</w:t>
+      </w:r>
+      <w:r>
+        <w:rPr>
+          <w:i/>
+          <w:iCs/>
+        </w:rPr>
+        <w:t>xterminate</w:t>
+      </w:r>
+      <w:r>
+        <w:t xml:space="preserve">” encoded at 8-bit/8KHz takes up </w:t>
+      </w:r>
+      <w:r>
+        <w:t xml:space="preserve">around </w:t>
+      </w:r>
+      <w:r>
+        <w:t>16K, uncompressed</w:t>
+      </w:r>
+      <w:r>
+        <w:t>.</w:t>
+      </w:r>
+      <w:r>
+        <w:t xml:space="preserve">  </w:t>
+      </w:r>
+      <w:r>
+        <w:t xml:space="preserve">At least it will </w:t>
+      </w:r>
+      <w:r>
+        <w:t>fit on a 16K sideway RAM chip</w:t>
+      </w:r>
+      <w:r>
+        <w:t>, which is good.</w:t>
+      </w:r>
+    </w:p>
+    <w:p>
+      <w:pPr>
+        <w:rPr>
+          <w:b/>
+          <w:bCs/>
+          <w:i/>
+          <w:iCs/>
+        </w:rPr>
+      </w:pPr>
+      <w:r>
+        <w:rPr>
+          <w:b/>
+          <w:bCs/>
+          <w:i/>
+          <w:iCs/>
+        </w:rPr>
+        <w:t>Fill in details</w:t>
+      </w:r>
+    </w:p>
+    <w:p>
+      <w:pPr>
+        <w:pStyle w:val="Heading1"/>
+      </w:pPr>
+      <w:r>
         <w:t>Miscellaneous</w:t>
       </w:r>
     </w:p>
@@ -16457,41 +16859,41 @@
         <w:pStyle w:val="Heading2"/>
       </w:pPr>
       <w:r>
+        <w:t>M</w:t>
+      </w:r>
+      <w:r>
+        <w:t xml:space="preserve">emory </w:t>
+      </w:r>
+      <w:r>
+        <w:t>usage and layout</w:t>
+      </w:r>
+    </w:p>
+    <w:p>
+      <w:r>
+        <w:t xml:space="preserve">This </w:t>
+      </w:r>
+      <w:r>
+        <w:t xml:space="preserve">section </w:t>
+      </w:r>
+      <w:r>
+        <w:t>describe</w:t>
+      </w:r>
+      <w:r>
+        <w:t>s</w:t>
+      </w:r>
+      <w:r>
+        <w:t xml:space="preserve"> the game’s memory layout, which was designed for a disc version of the game, where levels </w:t>
+      </w:r>
+      <w:r>
+        <w:t>are</w:t>
+      </w:r>
+      <w:r>
+        <w:t xml:space="preserve"> loaded/reloaded from disc.</w:t>
+      </w:r>
+    </w:p>
+    <w:p>
+      <w:r>
         <w:lastRenderedPageBreak/>
-        <w:t>M</w:t>
-      </w:r>
-      <w:r>
-        <w:t xml:space="preserve">emory </w:t>
-      </w:r>
-      <w:r>
-        <w:t>usage and layout</w:t>
-      </w:r>
-    </w:p>
-    <w:p>
-      <w:r>
-        <w:t xml:space="preserve">This </w:t>
-      </w:r>
-      <w:r>
-        <w:t xml:space="preserve">section </w:t>
-      </w:r>
-      <w:r>
-        <w:t>describe</w:t>
-      </w:r>
-      <w:r>
-        <w:t>s</w:t>
-      </w:r>
-      <w:r>
-        <w:t xml:space="preserve"> the game’s memory layout, which was designed for a disc version of the game, where levels </w:t>
-      </w:r>
-      <w:r>
-        <w:t>are</w:t>
-      </w:r>
-      <w:r>
-        <w:t xml:space="preserve"> loaded/reloaded from disc.</w:t>
-      </w:r>
-    </w:p>
-    <w:p>
-      <w:r>
         <w:t>The limited memory on the BBC micro creates a lot of challenges, so finding ways to eke out and repurpose memory is essential.  Thankfully, there are great resources online that help here.</w:t>
       </w:r>
       <w:r>
@@ -17857,7 +18259,6 @@
         </w:numPr>
       </w:pPr>
       <w:r>
-        <w:lastRenderedPageBreak/>
         <w:t>The stack (page 1) is reduced to just 64 bytes, allowing 192 bytes to be repurposed.</w:t>
       </w:r>
     </w:p>
@@ -17894,6 +18295,7 @@
         </w:numPr>
       </w:pPr>
       <w:r>
+        <w:lastRenderedPageBreak/>
         <w:t xml:space="preserve">Blue rows depict memory MOS and DFS uses but </w:t>
       </w:r>
       <w:r>
@@ -18012,7 +18414,15 @@
         <w:t>available</w:t>
       </w:r>
       <w:r>
-        <w:t>.  MOS/DFS use 896 bytes</w:t>
+        <w:t xml:space="preserve">.  MOS/DFS </w:t>
+      </w:r>
+      <w:proofErr w:type="gramStart"/>
+      <w:r>
+        <w:t>use</w:t>
+      </w:r>
+      <w:proofErr w:type="gramEnd"/>
+      <w:r>
+        <w:t xml:space="preserve"> 896 bytes</w:t>
       </w:r>
       <w:r>
         <w:t>.</w:t>
@@ -18980,6 +19390,7 @@
       <w:r>
         <w:t xml:space="preserve">The use of an object </w:t>
       </w:r>
+      <w:proofErr w:type="gramStart"/>
       <w:r>
         <w:rPr>
           <w:i/>
@@ -18987,6 +19398,7 @@
         </w:rPr>
         <w:t>redraw</w:t>
       </w:r>
+      <w:proofErr w:type="gramEnd"/>
       <w:r>
         <w:t xml:space="preserve"> flag ensure</w:t>
       </w:r>
@@ -19144,7 +19556,15 @@
         <w:t xml:space="preserve"> that sweeps across screen memory</w:t>
       </w:r>
       <w:r>
-        <w:t xml:space="preserve">. The code is executed every 32 frames (approx. twice a second) so it has a negligible impact on overall performance.  The algorithm is also quite efficient over small datasets which are already sorted, or close to being sorted.  Tests showed that the algorithm re-sorts the </w:t>
+        <w:t>. The code is executed every 32 frames (approx. twice a second</w:t>
+      </w:r>
+      <w:proofErr w:type="gramStart"/>
+      <w:r>
+        <w:t>)</w:t>
+      </w:r>
+      <w:proofErr w:type="gramEnd"/>
+      <w:r>
+        <w:t xml:space="preserve"> so it has a negligible impact on overall performance.  The algorithm is also quite efficient over small datasets which are already sorted, or close to being sorted.  Tests showed that the algorithm re-sorts the </w:t>
       </w:r>
       <w:r>
         <w:rPr>
@@ -20865,7 +21285,15 @@
         <w:t xml:space="preserve">  The game must </w:t>
       </w:r>
       <w:r>
-        <w:t xml:space="preserve">be robust (not crash) and </w:t>
+        <w:t>be robust (not crash</w:t>
+      </w:r>
+      <w:proofErr w:type="gramStart"/>
+      <w:r>
+        <w:t>)</w:t>
+      </w:r>
+      <w:proofErr w:type="gramEnd"/>
+      <w:r>
+        <w:t xml:space="preserve"> and </w:t>
       </w:r>
       <w:r>
         <w:t xml:space="preserve">its difficulty should </w:t>
@@ -21112,7 +21540,15 @@
     </w:p>
     <w:p>
       <w:r>
-        <w:t>From reading this document, it may appear that every decision taken was a good one, and things were fully thought though before implementation began, and that coding was purely a typing exercise, and that development proceeded without detours or missteps.  This was not the case.</w:t>
+        <w:t xml:space="preserve">From reading this document, it may appear that every decision taken was a good one, and things were fully thought though before implementation began, and that coding was purely a </w:t>
+      </w:r>
+      <w:proofErr w:type="gramStart"/>
+      <w:r>
+        <w:t>typing exercise</w:t>
+      </w:r>
+      <w:proofErr w:type="gramEnd"/>
+      <w:r>
+        <w:t>, and that development proceeded without detours or missteps.  This was not the case.</w:t>
       </w:r>
     </w:p>
     <w:p>
@@ -21453,14 +21889,24 @@
       <w:r>
         <w:t>#</w:t>
       </w:r>
-      <w:r>
-        <w:t xml:space="preserve">HI(…) or </w:t>
+      <w:proofErr w:type="gramStart"/>
+      <w:r>
+        <w:t>HI(</w:t>
+      </w:r>
+      <w:proofErr w:type="gramEnd"/>
+      <w:r>
+        <w:t xml:space="preserve">…) or </w:t>
       </w:r>
       <w:r>
         <w:t>#</w:t>
       </w:r>
-      <w:r>
-        <w:t>LO(…).</w:t>
+      <w:proofErr w:type="gramStart"/>
+      <w:r>
+        <w:t>LO(</w:t>
+      </w:r>
+      <w:proofErr w:type="gramEnd"/>
+      <w:r>
+        <w:t>…).</w:t>
       </w:r>
     </w:p>
     <w:p/>
@@ -21476,11 +21922,16 @@
       <w:r>
         <w:t xml:space="preserve">6502 </w:t>
       </w:r>
+      <w:proofErr w:type="gramStart"/>
       <w:r>
         <w:t>i</w:t>
       </w:r>
       <w:r>
-        <w:t xml:space="preserve">nstruction set - </w:t>
+        <w:t>nstruction</w:t>
+      </w:r>
+      <w:proofErr w:type="gramEnd"/>
+      <w:r>
+        <w:t xml:space="preserve"> set - </w:t>
       </w:r>
       <w:hyperlink r:id="rId19" w:history="1">
         <w:r>
@@ -21600,7 +22051,7 @@
     <mc:AlternateContent>
       <mc:Choice Requires="v">
         <w:pict>
-          <v:shapetype w14:anchorId="629477BF" id="_x0000_t75" coordsize="21600,21600" o:spt="75" o:preferrelative="t" path="m@4@5l@4@11@9@11@9@5xe" filled="f" stroked="f">
+          <v:shapetype w14:anchorId="06144C25" id="_x0000_t75" coordsize="21600,21600" o:spt="75" o:preferrelative="t" path="m@4@5l@4@11@9@11@9@5xe" filled="f" stroked="f">
             <v:stroke joinstyle="miter"/>
             <v:formulas>
               <v:f eqn="if lineDrawn pixelLineWidth 0"/>
@@ -21626,10 +22077,10 @@
       </mc:Choice>
       <mc:Fallback>
         <w:drawing>
-          <wp:inline distT="0" distB="0" distL="0" distR="0" wp14:anchorId="3560CAF1" wp14:editId="5D565C29">
+          <wp:inline distT="0" distB="0" distL="0" distR="0" wp14:anchorId="0F0A144F" wp14:editId="10B9CC28">
             <wp:extent cx="194650" cy="145988"/>
             <wp:effectExtent l="0" t="0" r="0" b="6985"/>
-            <wp:docPr id="1091973702" name="Picture 1"/>
+            <wp:docPr id="1026721579" name="Picture 1"/>
             <wp:cNvGraphicFramePr>
               <a:graphicFrameLocks xmlns:a="http://schemas.openxmlformats.org/drawingml/2006/main" noChangeAspect="1"/>
             </wp:cNvGraphicFramePr>
@@ -21667,17 +22118,17 @@
     <mc:AlternateContent>
       <mc:Choice Requires="v">
         <w:pict>
-          <v:shape w14:anchorId="522D1E56" id="Picture 1" o:spid="_x0000_i1025" type="#_x0000_t75" style="width:15.7pt;height:11.75pt;visibility:visible;mso-wrap-style:square">
+          <v:shape w14:anchorId="12ADDF77" id="Picture 1" o:spid="_x0000_i1025" type="#_x0000_t75" style="width:15.7pt;height:11.75pt;visibility:visible;mso-wrap-style:square">
             <v:imagedata r:id="rId3" o:title=""/>
           </v:shape>
         </w:pict>
       </mc:Choice>
       <mc:Fallback>
         <w:drawing>
-          <wp:inline distT="0" distB="0" distL="0" distR="0" wp14:anchorId="551A7E37" wp14:editId="7468DE57">
+          <wp:inline distT="0" distB="0" distL="0" distR="0" wp14:anchorId="42D9C983" wp14:editId="38147C29">
             <wp:extent cx="199177" cy="149383"/>
             <wp:effectExtent l="0" t="0" r="0" b="3175"/>
-            <wp:docPr id="547265190" name="Picture 1"/>
+            <wp:docPr id="1863282040" name="Picture 1"/>
             <wp:cNvGraphicFramePr>
               <a:graphicFrameLocks xmlns:a="http://schemas.openxmlformats.org/drawingml/2006/main" noChangeAspect="1"/>
             </wp:cNvGraphicFramePr>
@@ -24784,6 +25235,7 @@
   <w:style w:type="character" w:default="1" w:styleId="DefaultParagraphFont">
     <w:name w:val="Default Paragraph Font"/>
     <w:uiPriority w:val="1"/>
+    <w:semiHidden/>
     <w:unhideWhenUsed/>
   </w:style>
   <w:style w:type="table" w:default="1" w:styleId="TableNormal">

</xml_diff>